<commit_message>
FugaCliente 2.0: arquitectura en capas, nueva interfaz y logotipo
</commit_message>
<xml_diff>
--- a/docs/Informe_FugaCliente.docx
+++ b/docs/Informe_FugaCliente.docx
@@ -1442,7 +1442,7 @@
       <w:r>
         <w:drawing>
           <wp:inline xmlns:a="http://schemas.openxmlformats.org/drawingml/2006/main" xmlns:pic="http://schemas.openxmlformats.org/drawingml/2006/picture">
-            <wp:extent cx="6217920" cy="4086062"/>
+            <wp:extent cx="6217920" cy="4070146"/>
             <wp:docPr id="1" name="Picture 1"/>
             <wp:cNvGraphicFramePr>
               <a:graphicFrameLocks noChangeAspect="1"/>
@@ -1463,7 +1463,7 @@
                   <pic:spPr>
                     <a:xfrm>
                       <a:off x="0" y="0"/>
-                      <a:ext cx="6217920" cy="4086062"/>
+                      <a:ext cx="6217920" cy="4070146"/>
                     </a:xfrm>
                     <a:prstGeom prst="rect"/>
                   </pic:spPr>
@@ -1496,6 +1496,60 @@
     <w:p>
       <w:r>
         <w:t>Los logs HTTP se registran después de terminar la respuesta. Se omiten contraseñas, tokens y cuerpos de petición. Estos logs son de mejor esfuerzo; si su almacenamiento falla, la operación ya confirmada conserva su resultado.</w:t>
+      </w:r>
+    </w:p>
+    <w:p>
+      <w:pPr>
+        <w:pStyle w:val="Heading2"/>
+      </w:pPr>
+      <w:r>
+        <w:t>Arquitectura en capas (versión 2.0)</w:t>
+      </w:r>
+    </w:p>
+    <w:p>
+      <w:r>
+        <w:t>La versión 2.0 separa el servidor en cuatro capas con responsabilidades únicas. Las rutas declaran los endpoints y sus middlewares; los controladores traducen la petición HTTP a un caso de uso y eligen el código de respuesta; los servicios contienen las reglas de negocio, el motor de riesgo, la analítica y los reportes; y los repositorios encapsulan el acceso a SQL Server y MongoDB.</w:t>
+      </w:r>
+    </w:p>
+    <w:p>
+      <w:r>
+        <w:t>El archivo src/container.js actúa como raíz de composición: crea los servicios y les inyecta los repositorios por constructor. Gracias a esta inyección de dependencias, la misma lógica se ejecuta con las bases reales, con la demostración en memoria y con las 41 pruebas automáticas, sin modificar el código de negocio.</w:t>
+      </w:r>
+    </w:p>
+    <w:p>
+      <w:pPr>
+        <w:pStyle w:val="ListBullet"/>
+        <w:spacing w:after="100"/>
+      </w:pPr>
+      <w:r>
+        <w:t>Rutas: src/routes, un router por recurso, montado en /api/v1.</w:t>
+      </w:r>
+    </w:p>
+    <w:p>
+      <w:pPr>
+        <w:pStyle w:val="ListBullet"/>
+        <w:spacing w:after="100"/>
+      </w:pPr>
+      <w:r>
+        <w:t>Controladores: src/controllers, sin lógica de negocio ni SQL.</w:t>
+      </w:r>
+    </w:p>
+    <w:p>
+      <w:pPr>
+        <w:pStyle w:val="ListBullet"/>
+        <w:spacing w:after="100"/>
+      </w:pPr>
+      <w:r>
+        <w:t>Servicios: src/services, reglas de negocio independientes de HTTP.</w:t>
+      </w:r>
+    </w:p>
+    <w:p>
+      <w:pPr>
+        <w:pStyle w:val="ListBullet"/>
+        <w:spacing w:after="100"/>
+      </w:pPr>
+      <w:r>
+        <w:t>Repositorios: src/repositories, contrato común para SQL Server, MongoDB y memoria.</w:t>
       </w:r>
     </w:p>
     <w:p>
@@ -2703,6 +2757,19 @@
     <w:p>
       <w:r>
         <w:t>sp_RegisterIncident registra el caso y su evento con BEGIN TRAN, COMMIT y rollback ante errores. sp_UpdateIncidentStatus comprueba ExpectedVersion y bloquea la fila mientras actualiza. sp_CreateRetentionAction valida responsable, cliente y fecha; sp_CompleteRetentionAction conserva un resultado confirmado y permite reintentar el mismo resultado sin sobrescribirlo.</w:t>
+      </w:r>
+    </w:p>
+    <w:p>
+      <w:pPr>
+        <w:pStyle w:val="Heading2"/>
+      </w:pPr>
+      <w:r>
+        <w:t>Vistas y consultas de lectura</w:t>
+      </w:r>
+    </w:p>
+    <w:p>
+      <w:r>
+        <w:t>Las vistas vw_IncidentDetail y vw_RetentionActionDetail encapsulan los JOIN con clientes, servicios, categorías y usuarios; el repositorio solo las consulta con parámetros. La vista vw_ClientIncidentSummary resume por cliente el total de incidencias, las pendientes y las de los últimos 30 días para reportes en SSMS o Power BI. El script sigue siendo idempotente y el diagnóstico verifica los cinco procedimientos y las tres vistas.</w:t>
       </w:r>
     </w:p>
     <w:p>
@@ -3946,7 +4013,7 @@
     </w:p>
     <w:p>
       <w:r>
-        <w:t>La base del API es http://localhost:3000/api. Login, salud y OpenAPI son públicos. Los recursos de negocio exigen Authorization Bearer con un JWT firmado, y el servidor vuelve a consultar el estado y rol del usuario. Las contraseñas se almacenan como hashes bcrypt.</w:t>
+        <w:t>La base del API es http://localhost:3000/api/v1 (versionada; /api se conserva como alias) y su referencia interactiva está en /api/docs. Login, salud y OpenAPI son públicos. Los recursos de negocio exigen Authorization Bearer con un JWT firmado, y el servidor vuelve a consultar el estado y rol del usuario. Las contraseñas se almacenan como hashes bcrypt.</w:t>
       </w:r>
     </w:p>
     <w:tbl>
@@ -5753,7 +5820,60 @@
     </w:p>
     <w:p>
       <w:r>
-        <w:t>Los listados admiten page desde 1 y limit hasta 100. La documentación completa, los cuerpos JSON y los filtros están en docs/API.md. OpenAPI define los contratos y la colección de Postman conserva automáticamente JWT e IDs durante un recorrido de 20 peticiones.</w:t>
+        <w:t>Los listados admiten page desde 1 y limit hasta 100. La documentación completa, los cuerpos JSON y los filtros están en docs/API.md. OpenAPI define los contratos y la colección de Postman conserva automáticamente JWT e IDs durante un recorrido de 23 peticiones.</w:t>
+      </w:r>
+    </w:p>
+    <w:p>
+      <w:pPr>
+        <w:pStyle w:val="Heading2"/>
+      </w:pPr>
+      <w:r>
+        <w:t>Recursos agregados en la versión 2.0</w:t>
+      </w:r>
+    </w:p>
+    <w:p>
+      <w:pPr>
+        <w:pStyle w:val="ListBullet"/>
+        <w:spacing w:after="100"/>
+      </w:pPr>
+      <w:r>
+        <w:t>PATCH /users/{id}: rol, nombre y acceso; un administrador no puede degradarse y siempre queda uno activo.</w:t>
+      </w:r>
+    </w:p>
+    <w:p>
+      <w:pPr>
+        <w:pStyle w:val="ListBullet"/>
+        <w:spacing w:after="100"/>
+      </w:pPr>
+      <w:r>
+        <w:t>GET y PATCH /services/{id}: consulta y edición del SLA.</w:t>
+      </w:r>
+    </w:p>
+    <w:p>
+      <w:pPr>
+        <w:pStyle w:val="ListBullet"/>
+        <w:spacing w:after="100"/>
+      </w:pPr>
+      <w:r>
+        <w:t>GET /logs/summary: agregación MongoDB con $facet (eventos por tipo, por día y métricas HTTP).</w:t>
+      </w:r>
+    </w:p>
+    <w:p>
+      <w:pPr>
+        <w:pStyle w:val="ListBullet"/>
+        <w:spacing w:after="100"/>
+      </w:pPr>
+      <w:r>
+        <w:t>GET /reports/clients.csv: exportación del riesgo protegida contra inyección de fórmulas.</w:t>
+      </w:r>
+    </w:p>
+    <w:p>
+      <w:pPr>
+        <w:pStyle w:val="ListBullet"/>
+        <w:spacing w:after="100"/>
+      </w:pPr>
+      <w:r>
+        <w:t>GET /dashboard ampliado: tendencia semanal, motivos, carga por servicio, factores del riesgo y resultados de retención.</w:t>
       </w:r>
     </w:p>
     <w:p>
@@ -6493,6 +6613,11 @@
       </w:pPr>
     </w:p>
     <w:p>
+      <w:r>
+        <w:t>En la versión 2.0 la verificación comprende 41 pruebas automáticas aprobadas, la revisión de sintaxis de 74 archivos y un recorrido de la interfaz en Chromium en escritorio y móvil, en modo claro y oscuro, sin errores de consola. La integración continua ejecuta estas comprobaciones con Node.js 22 y 24.</w:t>
+      </w:r>
+    </w:p>
+    <w:p>
       <w:pPr>
         <w:pStyle w:val="Heading2"/>
       </w:pPr>

</xml_diff>